<commit_message>
AI _ App - ppl Management initial setup
</commit_message>
<xml_diff>
--- a/ppl-management/deploy/docs/AI-1-Springboot.docx
+++ b/ppl-management/deploy/docs/AI-1-Springboot.docx
@@ -4715,6 +4715,26 @@
                 <w:rFonts w:ascii="Segoe UI Emoji" w:hAnsi="Segoe UI Emoji" w:cs="Segoe UI Emoji"/>
               </w:rPr>
             </w:pPr>
+            <w:r>
+              <w:rPr>
+                <w:rFonts w:ascii="Segoe UI Emoji" w:hAnsi="Segoe UI Emoji" w:cs="Segoe UI Emoji"/>
+              </w:rPr>
+              <w:t xml:space="preserve">👉 Do you want me to also prepare a </w:t>
+            </w:r>
+            <w:r>
+              <w:rPr>
+                <w:rFonts w:ascii="Segoe UI Emoji" w:hAnsi="Segoe UI Emoji" w:cs="Segoe UI Emoji"/>
+                <w:b/>
+                <w:bCs/>
+              </w:rPr>
+              <w:t>Kibana “Log + SLO Correlation” dashboard</w:t>
+            </w:r>
+            <w:r>
+              <w:rPr>
+                <w:rFonts w:ascii="Segoe UI Emoji" w:hAnsi="Segoe UI Emoji" w:cs="Segoe UI Emoji"/>
+              </w:rPr>
+              <w:t xml:space="preserve"> template, where clicking an SLO spike filters the logs automatically to that time window?</w:t>
+            </w:r>
           </w:p>
         </w:tc>
         <w:tc>
@@ -4761,6 +4781,33 @@
                 <w:rFonts w:ascii="Segoe UI Emoji" w:hAnsi="Segoe UI Emoji" w:cs="Segoe UI Emoji"/>
               </w:rPr>
             </w:pPr>
+            <w:r>
+              <w:rPr>
+                <w:rFonts w:ascii="Segoe UI Emoji" w:hAnsi="Segoe UI Emoji" w:cs="Segoe UI Emoji"/>
+              </w:rPr>
+              <w:t xml:space="preserve">👉 Do you want me to also add a </w:t>
+            </w:r>
+            <w:r>
+              <w:rPr>
+                <w:rFonts w:ascii="Segoe UI Emoji" w:hAnsi="Segoe UI Emoji" w:cs="Segoe UI Emoji"/>
+                <w:b/>
+                <w:bCs/>
+              </w:rPr>
+              <w:t>Grafana → Kibana deep link</w:t>
+            </w:r>
+            <w:r>
+              <w:rPr>
+                <w:rFonts w:ascii="Segoe UI Emoji" w:hAnsi="Segoe UI Emoji" w:cs="Segoe UI Emoji"/>
+              </w:rPr>
+              <w:t xml:space="preserve"> (so clicking an error spike in Grafana opens the Kibana </w:t>
+            </w:r>
+            <w:r>
+              <w:rPr>
+                <w:rFonts w:ascii="Segoe UI Emoji" w:hAnsi="Segoe UI Emoji" w:cs="Segoe UI Emoji"/>
+              </w:rPr>
+              <w:lastRenderedPageBreak/>
+              <w:t>dashboard filtered to the same time window)?</w:t>
+            </w:r>
           </w:p>
         </w:tc>
         <w:tc>
@@ -4807,6 +4854,1300 @@
                 <w:rFonts w:ascii="Segoe UI Emoji" w:hAnsi="Segoe UI Emoji" w:cs="Segoe UI Emoji"/>
               </w:rPr>
             </w:pPr>
+            <w:r>
+              <w:rPr>
+                <w:rFonts w:ascii="Segoe UI Emoji" w:hAnsi="Segoe UI Emoji" w:cs="Segoe UI Emoji"/>
+              </w:rPr>
+              <w:t xml:space="preserve">👉 Do you want me to also add a </w:t>
+            </w:r>
+            <w:r>
+              <w:rPr>
+                <w:rFonts w:ascii="Segoe UI Emoji" w:hAnsi="Segoe UI Emoji" w:cs="Segoe UI Emoji"/>
+                <w:b/>
+                <w:bCs/>
+              </w:rPr>
+              <w:t>Kibana → Grafana link</w:t>
+            </w:r>
+            <w:r>
+              <w:rPr>
+                <w:rFonts w:ascii="Segoe UI Emoji" w:hAnsi="Segoe UI Emoji" w:cs="Segoe UI Emoji"/>
+              </w:rPr>
+              <w:t xml:space="preserve"> (so from a log entry you can jump back into Grafana Explore, pre-filtered by </w:t>
+            </w:r>
+            <w:proofErr w:type="spellStart"/>
+            <w:r>
+              <w:rPr>
+                <w:rFonts w:ascii="Segoe UI Emoji" w:hAnsi="Segoe UI Emoji" w:cs="Segoe UI Emoji"/>
+              </w:rPr>
+              <w:t>traceId</w:t>
+            </w:r>
+            <w:proofErr w:type="spellEnd"/>
+            <w:r>
+              <w:rPr>
+                <w:rFonts w:ascii="Segoe UI Emoji" w:hAnsi="Segoe UI Emoji" w:cs="Segoe UI Emoji"/>
+              </w:rPr>
+              <w:t xml:space="preserve"> or time window)?</w:t>
+            </w:r>
+          </w:p>
+        </w:tc>
+        <w:tc>
+          <w:tcPr>
+            <w:tcW w:w="2925" w:type="dxa"/>
+          </w:tcPr>
+          <w:p>
+            <w:pPr>
+              <w:pStyle w:val="ListParagraph"/>
+              <w:numPr>
+                <w:ilvl w:val="0"/>
+                <w:numId w:val="1"/>
+              </w:numPr>
+              <w:ind w:left="0" w:firstLine="0"/>
+            </w:pPr>
+          </w:p>
+        </w:tc>
+      </w:tr>
+      <w:tr>
+        <w:tc>
+          <w:tcPr>
+            <w:tcW w:w="2515" w:type="dxa"/>
+          </w:tcPr>
+          <w:p>
+            <w:pPr>
+              <w:pStyle w:val="ListParagraph"/>
+              <w:numPr>
+                <w:ilvl w:val="0"/>
+                <w:numId w:val="1"/>
+              </w:numPr>
+              <w:ind w:left="0" w:firstLine="0"/>
+            </w:pPr>
+          </w:p>
+        </w:tc>
+        <w:tc>
+          <w:tcPr>
+            <w:tcW w:w="3190" w:type="dxa"/>
+          </w:tcPr>
+          <w:p>
+            <w:pPr>
+              <w:pStyle w:val="ListParagraph"/>
+              <w:ind w:left="0"/>
+              <w:rPr>
+                <w:rFonts w:ascii="Segoe UI Emoji" w:hAnsi="Segoe UI Emoji" w:cs="Segoe UI Emoji"/>
+              </w:rPr>
+            </w:pPr>
+            <w:r>
+              <w:rPr>
+                <w:rFonts w:ascii="Segoe UI Emoji" w:hAnsi="Segoe UI Emoji" w:cs="Segoe UI Emoji"/>
+              </w:rPr>
+              <w:t xml:space="preserve">👉 Do you want me to also add a </w:t>
+            </w:r>
+            <w:r>
+              <w:rPr>
+                <w:rFonts w:ascii="Segoe UI Emoji" w:hAnsi="Segoe UI Emoji" w:cs="Segoe UI Emoji"/>
+                <w:b/>
+                <w:bCs/>
+              </w:rPr>
+              <w:t>Grafana + Kibana unified homepage dashboard</w:t>
+            </w:r>
+            <w:r>
+              <w:rPr>
+                <w:rFonts w:ascii="Segoe UI Emoji" w:hAnsi="Segoe UI Emoji" w:cs="Segoe UI Emoji"/>
+              </w:rPr>
+              <w:t xml:space="preserve"> (single pane of glass) with quick links to SLO panels, logs, and traces?</w:t>
+            </w:r>
+          </w:p>
+        </w:tc>
+        <w:tc>
+          <w:tcPr>
+            <w:tcW w:w="2925" w:type="dxa"/>
+          </w:tcPr>
+          <w:p>
+            <w:pPr>
+              <w:pStyle w:val="ListParagraph"/>
+              <w:numPr>
+                <w:ilvl w:val="0"/>
+                <w:numId w:val="1"/>
+              </w:numPr>
+              <w:ind w:left="0" w:firstLine="0"/>
+            </w:pPr>
+          </w:p>
+        </w:tc>
+      </w:tr>
+      <w:tr>
+        <w:tc>
+          <w:tcPr>
+            <w:tcW w:w="2515" w:type="dxa"/>
+          </w:tcPr>
+          <w:p>
+            <w:pPr>
+              <w:pStyle w:val="ListParagraph"/>
+              <w:numPr>
+                <w:ilvl w:val="0"/>
+                <w:numId w:val="1"/>
+              </w:numPr>
+              <w:ind w:left="0" w:firstLine="0"/>
+            </w:pPr>
+          </w:p>
+        </w:tc>
+        <w:tc>
+          <w:tcPr>
+            <w:tcW w:w="3190" w:type="dxa"/>
+          </w:tcPr>
+          <w:p>
+            <w:pPr>
+              <w:pStyle w:val="ListParagraph"/>
+              <w:ind w:left="0"/>
+              <w:rPr>
+                <w:rFonts w:ascii="Segoe UI Emoji" w:hAnsi="Segoe UI Emoji" w:cs="Segoe UI Emoji"/>
+              </w:rPr>
+            </w:pPr>
+            <w:r>
+              <w:rPr>
+                <w:rFonts w:ascii="Segoe UI Emoji" w:hAnsi="Segoe UI Emoji" w:cs="Segoe UI Emoji"/>
+              </w:rPr>
+              <w:t xml:space="preserve">👉 Would you like me to also prepare a </w:t>
+            </w:r>
+            <w:r>
+              <w:rPr>
+                <w:rFonts w:ascii="Segoe UI Emoji" w:hAnsi="Segoe UI Emoji" w:cs="Segoe UI Emoji"/>
+                <w:b/>
+                <w:bCs/>
+              </w:rPr>
+              <w:t>Kibana landing dashboard</w:t>
+            </w:r>
+            <w:r>
+              <w:rPr>
+                <w:rFonts w:ascii="Segoe UI Emoji" w:hAnsi="Segoe UI Emoji" w:cs="Segoe UI Emoji"/>
+              </w:rPr>
+              <w:t xml:space="preserve"> (mirroring Grafana’s homepage, but log-centric: error budget widget + recent errors + </w:t>
+            </w:r>
+            <w:proofErr w:type="spellStart"/>
+            <w:r>
+              <w:rPr>
+                <w:rFonts w:ascii="Segoe UI Emoji" w:hAnsi="Segoe UI Emoji" w:cs="Segoe UI Emoji"/>
+              </w:rPr>
+              <w:t>traceId</w:t>
+            </w:r>
+            <w:proofErr w:type="spellEnd"/>
+            <w:r>
+              <w:rPr>
+                <w:rFonts w:ascii="Segoe UI Emoji" w:hAnsi="Segoe UI Emoji" w:cs="Segoe UI Emoji"/>
+              </w:rPr>
+              <w:t xml:space="preserve"> quick search)?</w:t>
+            </w:r>
+          </w:p>
+        </w:tc>
+        <w:tc>
+          <w:tcPr>
+            <w:tcW w:w="2925" w:type="dxa"/>
+          </w:tcPr>
+          <w:p>
+            <w:pPr>
+              <w:pStyle w:val="ListParagraph"/>
+              <w:numPr>
+                <w:ilvl w:val="0"/>
+                <w:numId w:val="1"/>
+              </w:numPr>
+              <w:ind w:left="0" w:firstLine="0"/>
+            </w:pPr>
+          </w:p>
+        </w:tc>
+      </w:tr>
+      <w:tr>
+        <w:tc>
+          <w:tcPr>
+            <w:tcW w:w="2515" w:type="dxa"/>
+          </w:tcPr>
+          <w:p>
+            <w:pPr>
+              <w:pStyle w:val="ListParagraph"/>
+              <w:numPr>
+                <w:ilvl w:val="0"/>
+                <w:numId w:val="1"/>
+              </w:numPr>
+              <w:ind w:left="0" w:firstLine="0"/>
+            </w:pPr>
+          </w:p>
+        </w:tc>
+        <w:tc>
+          <w:tcPr>
+            <w:tcW w:w="3190" w:type="dxa"/>
+          </w:tcPr>
+          <w:p>
+            <w:pPr>
+              <w:pStyle w:val="ListParagraph"/>
+              <w:ind w:left="0"/>
+              <w:rPr>
+                <w:rFonts w:ascii="Segoe UI Emoji" w:hAnsi="Segoe UI Emoji" w:cs="Segoe UI Emoji"/>
+              </w:rPr>
+            </w:pPr>
+            <w:r>
+              <w:rPr>
+                <w:rFonts w:ascii="Segoe UI Emoji" w:hAnsi="Segoe UI Emoji" w:cs="Segoe UI Emoji"/>
+              </w:rPr>
+              <w:t xml:space="preserve">👉 Do you want me to also design a </w:t>
+            </w:r>
+            <w:r>
+              <w:rPr>
+                <w:rFonts w:ascii="Segoe UI Emoji" w:hAnsi="Segoe UI Emoji" w:cs="Segoe UI Emoji"/>
+                <w:b/>
+                <w:bCs/>
+              </w:rPr>
+              <w:t>Zipkin-Grafana integration</w:t>
+            </w:r>
+            <w:r>
+              <w:rPr>
+                <w:rFonts w:ascii="Segoe UI Emoji" w:hAnsi="Segoe UI Emoji" w:cs="Segoe UI Emoji"/>
+              </w:rPr>
+              <w:t xml:space="preserve"> (so traces can be visualized directly inside Grafana panels, not just in Zipkin UI)?</w:t>
+            </w:r>
+          </w:p>
+        </w:tc>
+        <w:tc>
+          <w:tcPr>
+            <w:tcW w:w="2925" w:type="dxa"/>
+          </w:tcPr>
+          <w:p>
+            <w:pPr>
+              <w:pStyle w:val="ListParagraph"/>
+              <w:numPr>
+                <w:ilvl w:val="0"/>
+                <w:numId w:val="1"/>
+              </w:numPr>
+              <w:ind w:left="0" w:firstLine="0"/>
+            </w:pPr>
+          </w:p>
+        </w:tc>
+      </w:tr>
+      <w:tr>
+        <w:tc>
+          <w:tcPr>
+            <w:tcW w:w="2515" w:type="dxa"/>
+          </w:tcPr>
+          <w:p>
+            <w:pPr>
+              <w:pStyle w:val="ListParagraph"/>
+              <w:numPr>
+                <w:ilvl w:val="0"/>
+                <w:numId w:val="1"/>
+              </w:numPr>
+              <w:ind w:left="0" w:firstLine="0"/>
+            </w:pPr>
+          </w:p>
+        </w:tc>
+        <w:tc>
+          <w:tcPr>
+            <w:tcW w:w="3190" w:type="dxa"/>
+          </w:tcPr>
+          <w:p>
+            <w:pPr>
+              <w:pStyle w:val="ListParagraph"/>
+              <w:ind w:left="0"/>
+              <w:rPr>
+                <w:rFonts w:ascii="Segoe UI Emoji" w:hAnsi="Segoe UI Emoji" w:cs="Segoe UI Emoji"/>
+              </w:rPr>
+            </w:pPr>
+            <w:r>
+              <w:rPr>
+                <w:rFonts w:ascii="Segoe UI Emoji" w:hAnsi="Segoe UI Emoji" w:cs="Segoe UI Emoji"/>
+              </w:rPr>
+              <w:t xml:space="preserve">👉 Do you want me to also prepare a </w:t>
+            </w:r>
+            <w:r>
+              <w:rPr>
+                <w:rFonts w:ascii="Segoe UI Emoji" w:hAnsi="Segoe UI Emoji" w:cs="Segoe UI Emoji"/>
+                <w:b/>
+                <w:bCs/>
+              </w:rPr>
+              <w:t>Grafana “Golden Signals Dashboard”</w:t>
+            </w:r>
+            <w:r>
+              <w:rPr>
+                <w:rFonts w:ascii="Segoe UI Emoji" w:hAnsi="Segoe UI Emoji" w:cs="Segoe UI Emoji"/>
+              </w:rPr>
+              <w:t xml:space="preserve"> (latency, traffic, errors, saturation) with trace samples from Zipkin?</w:t>
+            </w:r>
+          </w:p>
+        </w:tc>
+        <w:tc>
+          <w:tcPr>
+            <w:tcW w:w="2925" w:type="dxa"/>
+          </w:tcPr>
+          <w:p>
+            <w:pPr>
+              <w:pStyle w:val="ListParagraph"/>
+              <w:numPr>
+                <w:ilvl w:val="0"/>
+                <w:numId w:val="1"/>
+              </w:numPr>
+              <w:ind w:left="0" w:firstLine="0"/>
+            </w:pPr>
+          </w:p>
+        </w:tc>
+      </w:tr>
+      <w:tr>
+        <w:tc>
+          <w:tcPr>
+            <w:tcW w:w="2515" w:type="dxa"/>
+          </w:tcPr>
+          <w:p>
+            <w:pPr>
+              <w:pStyle w:val="ListParagraph"/>
+              <w:numPr>
+                <w:ilvl w:val="0"/>
+                <w:numId w:val="1"/>
+              </w:numPr>
+              <w:ind w:left="0" w:firstLine="0"/>
+            </w:pPr>
+          </w:p>
+        </w:tc>
+        <w:tc>
+          <w:tcPr>
+            <w:tcW w:w="3190" w:type="dxa"/>
+          </w:tcPr>
+          <w:p>
+            <w:pPr>
+              <w:pStyle w:val="ListParagraph"/>
+              <w:ind w:left="0"/>
+              <w:rPr>
+                <w:rFonts w:ascii="Segoe UI Emoji" w:hAnsi="Segoe UI Emoji" w:cs="Segoe UI Emoji"/>
+              </w:rPr>
+            </w:pPr>
+            <w:r>
+              <w:rPr>
+                <w:rFonts w:ascii="Segoe UI Emoji" w:hAnsi="Segoe UI Emoji" w:cs="Segoe UI Emoji"/>
+              </w:rPr>
+              <w:t xml:space="preserve">👉 Do you want me to also create a </w:t>
+            </w:r>
+            <w:r>
+              <w:rPr>
+                <w:rFonts w:ascii="Segoe UI Emoji" w:hAnsi="Segoe UI Emoji" w:cs="Segoe UI Emoji"/>
+                <w:b/>
+                <w:bCs/>
+              </w:rPr>
+              <w:t>Runbook template</w:t>
+            </w:r>
+            <w:r>
+              <w:rPr>
+                <w:rFonts w:ascii="Segoe UI Emoji" w:hAnsi="Segoe UI Emoji" w:cs="Segoe UI Emoji"/>
+              </w:rPr>
+              <w:t xml:space="preserve"> (Markdown + Confluence export) that your alerts </w:t>
+            </w:r>
+            <w:r>
+              <w:rPr>
+                <w:rFonts w:ascii="Segoe UI Emoji" w:hAnsi="Segoe UI Emoji" w:cs="Segoe UI Emoji"/>
+              </w:rPr>
+              <w:lastRenderedPageBreak/>
+              <w:t>(Slack/Teams) and dashboards can link to, so responders know exact steps to take during incidents?</w:t>
+            </w:r>
+          </w:p>
+        </w:tc>
+        <w:tc>
+          <w:tcPr>
+            <w:tcW w:w="2925" w:type="dxa"/>
+          </w:tcPr>
+          <w:p>
+            <w:pPr>
+              <w:pStyle w:val="ListParagraph"/>
+              <w:numPr>
+                <w:ilvl w:val="0"/>
+                <w:numId w:val="1"/>
+              </w:numPr>
+              <w:ind w:left="0" w:firstLine="0"/>
+            </w:pPr>
+          </w:p>
+        </w:tc>
+      </w:tr>
+      <w:tr>
+        <w:tc>
+          <w:tcPr>
+            <w:tcW w:w="2515" w:type="dxa"/>
+          </w:tcPr>
+          <w:p>
+            <w:pPr>
+              <w:pStyle w:val="ListParagraph"/>
+              <w:numPr>
+                <w:ilvl w:val="0"/>
+                <w:numId w:val="1"/>
+              </w:numPr>
+              <w:ind w:left="0" w:firstLine="0"/>
+            </w:pPr>
+          </w:p>
+        </w:tc>
+        <w:tc>
+          <w:tcPr>
+            <w:tcW w:w="3190" w:type="dxa"/>
+          </w:tcPr>
+          <w:p>
+            <w:pPr>
+              <w:pStyle w:val="ListParagraph"/>
+              <w:ind w:left="0"/>
+              <w:rPr>
+                <w:rFonts w:ascii="Segoe UI Emoji" w:hAnsi="Segoe UI Emoji" w:cs="Segoe UI Emoji"/>
+              </w:rPr>
+            </w:pPr>
+            <w:r>
+              <w:rPr>
+                <w:rFonts w:ascii="Segoe UI Emoji" w:hAnsi="Segoe UI Emoji" w:cs="Segoe UI Emoji"/>
+              </w:rPr>
+              <w:t xml:space="preserve">👉 Do you want me to also prepare a </w:t>
+            </w:r>
+            <w:r>
+              <w:rPr>
+                <w:rFonts w:ascii="Segoe UI Emoji" w:hAnsi="Segoe UI Emoji" w:cs="Segoe UI Emoji"/>
+                <w:b/>
+                <w:bCs/>
+              </w:rPr>
+              <w:t>generic runbook template</w:t>
+            </w:r>
+            <w:r>
+              <w:rPr>
+                <w:rFonts w:ascii="Segoe UI Emoji" w:hAnsi="Segoe UI Emoji" w:cs="Segoe UI Emoji"/>
+              </w:rPr>
+              <w:t xml:space="preserve"> (parameterized for </w:t>
+            </w:r>
+            <w:r>
+              <w:rPr>
+                <w:rFonts w:ascii="Segoe UI Emoji" w:hAnsi="Segoe UI Emoji" w:cs="Segoe UI Emoji"/>
+                <w:i/>
+                <w:iCs/>
+              </w:rPr>
+              <w:t>any microservice</w:t>
+            </w:r>
+            <w:r>
+              <w:rPr>
+                <w:rFonts w:ascii="Segoe UI Emoji" w:hAnsi="Segoe UI Emoji" w:cs="Segoe UI Emoji"/>
+              </w:rPr>
+              <w:t>) so you can standardize runbooks across your org, not just for ppl-management?</w:t>
+            </w:r>
+          </w:p>
+        </w:tc>
+        <w:tc>
+          <w:tcPr>
+            <w:tcW w:w="2925" w:type="dxa"/>
+          </w:tcPr>
+          <w:p>
+            <w:pPr>
+              <w:pStyle w:val="ListParagraph"/>
+              <w:numPr>
+                <w:ilvl w:val="0"/>
+                <w:numId w:val="1"/>
+              </w:numPr>
+              <w:ind w:left="0" w:firstLine="0"/>
+            </w:pPr>
+          </w:p>
+        </w:tc>
+      </w:tr>
+      <w:tr>
+        <w:tc>
+          <w:tcPr>
+            <w:tcW w:w="2515" w:type="dxa"/>
+          </w:tcPr>
+          <w:p>
+            <w:pPr>
+              <w:pStyle w:val="ListParagraph"/>
+              <w:numPr>
+                <w:ilvl w:val="0"/>
+                <w:numId w:val="1"/>
+              </w:numPr>
+              <w:ind w:left="0" w:firstLine="0"/>
+            </w:pPr>
+          </w:p>
+        </w:tc>
+        <w:tc>
+          <w:tcPr>
+            <w:tcW w:w="3190" w:type="dxa"/>
+          </w:tcPr>
+          <w:p>
+            <w:pPr>
+              <w:pStyle w:val="ListParagraph"/>
+              <w:ind w:left="0"/>
+              <w:rPr>
+                <w:rFonts w:ascii="Segoe UI Emoji" w:hAnsi="Segoe UI Emoji" w:cs="Segoe UI Emoji"/>
+              </w:rPr>
+            </w:pPr>
+          </w:p>
+        </w:tc>
+        <w:tc>
+          <w:tcPr>
+            <w:tcW w:w="2925" w:type="dxa"/>
+          </w:tcPr>
+          <w:p>
+            <w:pPr>
+              <w:pStyle w:val="ListParagraph"/>
+              <w:numPr>
+                <w:ilvl w:val="0"/>
+                <w:numId w:val="1"/>
+              </w:numPr>
+              <w:ind w:left="0" w:firstLine="0"/>
+            </w:pPr>
+          </w:p>
+        </w:tc>
+      </w:tr>
+      <w:tr>
+        <w:tc>
+          <w:tcPr>
+            <w:tcW w:w="2515" w:type="dxa"/>
+          </w:tcPr>
+          <w:p>
+            <w:pPr>
+              <w:pStyle w:val="ListParagraph"/>
+              <w:numPr>
+                <w:ilvl w:val="0"/>
+                <w:numId w:val="1"/>
+              </w:numPr>
+              <w:ind w:left="0" w:firstLine="0"/>
+            </w:pPr>
+          </w:p>
+        </w:tc>
+        <w:tc>
+          <w:tcPr>
+            <w:tcW w:w="3190" w:type="dxa"/>
+          </w:tcPr>
+          <w:p>
+            <w:pPr>
+              <w:pStyle w:val="ListParagraph"/>
+              <w:ind w:left="0"/>
+              <w:rPr>
+                <w:rFonts w:ascii="Segoe UI Emoji" w:hAnsi="Segoe UI Emoji" w:cs="Segoe UI Emoji"/>
+              </w:rPr>
+            </w:pPr>
+            <w:r>
+              <w:rPr>
+                <w:rFonts w:ascii="Segoe UI Emoji" w:hAnsi="Segoe UI Emoji" w:cs="Segoe UI Emoji"/>
+              </w:rPr>
+              <w:t xml:space="preserve">👉 Do you want me to also prepare a </w:t>
+            </w:r>
+            <w:r>
+              <w:rPr>
+                <w:rFonts w:ascii="Segoe UI Emoji" w:hAnsi="Segoe UI Emoji" w:cs="Segoe UI Emoji"/>
+                <w:b/>
+                <w:bCs/>
+              </w:rPr>
+              <w:t>Helm chart helper</w:t>
+            </w:r>
+            <w:r>
+              <w:rPr>
+                <w:rFonts w:ascii="Segoe UI Emoji" w:hAnsi="Segoe UI Emoji" w:cs="Segoe UI Emoji"/>
+              </w:rPr>
+              <w:t xml:space="preserve"> that auto-generates </w:t>
+            </w:r>
+            <w:proofErr w:type="spellStart"/>
+            <w:r>
+              <w:rPr>
+                <w:rFonts w:ascii="Segoe UI Emoji" w:hAnsi="Segoe UI Emoji" w:cs="Segoe UI Emoji"/>
+              </w:rPr>
+              <w:t>runbook_url</w:t>
+            </w:r>
+            <w:proofErr w:type="spellEnd"/>
+            <w:r>
+              <w:rPr>
+                <w:rFonts w:ascii="Segoe UI Emoji" w:hAnsi="Segoe UI Emoji" w:cs="Segoe UI Emoji"/>
+              </w:rPr>
+              <w:t xml:space="preserve"> annotation links per service, so teams don’t forget to wire them into alerts?</w:t>
+            </w:r>
+          </w:p>
+        </w:tc>
+        <w:tc>
+          <w:tcPr>
+            <w:tcW w:w="2925" w:type="dxa"/>
+          </w:tcPr>
+          <w:p>
+            <w:pPr>
+              <w:pStyle w:val="ListParagraph"/>
+              <w:numPr>
+                <w:ilvl w:val="0"/>
+                <w:numId w:val="1"/>
+              </w:numPr>
+              <w:ind w:left="0" w:firstLine="0"/>
+            </w:pPr>
+          </w:p>
+        </w:tc>
+      </w:tr>
+      <w:tr>
+        <w:tc>
+          <w:tcPr>
+            <w:tcW w:w="2515" w:type="dxa"/>
+          </w:tcPr>
+          <w:p>
+            <w:pPr>
+              <w:pStyle w:val="ListParagraph"/>
+              <w:numPr>
+                <w:ilvl w:val="0"/>
+                <w:numId w:val="1"/>
+              </w:numPr>
+              <w:ind w:left="0" w:firstLine="0"/>
+            </w:pPr>
+          </w:p>
+        </w:tc>
+        <w:tc>
+          <w:tcPr>
+            <w:tcW w:w="3190" w:type="dxa"/>
+          </w:tcPr>
+          <w:p>
+            <w:pPr>
+              <w:pStyle w:val="ListParagraph"/>
+              <w:ind w:left="0"/>
+              <w:rPr>
+                <w:rFonts w:ascii="Segoe UI Emoji" w:hAnsi="Segoe UI Emoji" w:cs="Segoe UI Emoji"/>
+              </w:rPr>
+            </w:pPr>
+            <w:r>
+              <w:rPr>
+                <w:rFonts w:ascii="Segoe UI Emoji" w:hAnsi="Segoe UI Emoji" w:cs="Segoe UI Emoji"/>
+              </w:rPr>
+              <w:t xml:space="preserve">👉 Do you want me to also extend this </w:t>
+            </w:r>
+            <w:proofErr w:type="gramStart"/>
+            <w:r>
+              <w:rPr>
+                <w:rFonts w:ascii="Segoe UI Emoji" w:hAnsi="Segoe UI Emoji" w:cs="Segoe UI Emoji"/>
+              </w:rPr>
+              <w:t>helper</w:t>
+            </w:r>
+            <w:proofErr w:type="gramEnd"/>
+            <w:r>
+              <w:rPr>
+                <w:rFonts w:ascii="Segoe UI Emoji" w:hAnsi="Segoe UI Emoji" w:cs="Segoe UI Emoji"/>
+              </w:rPr>
+              <w:t xml:space="preserve"> so it </w:t>
+            </w:r>
+            <w:r>
+              <w:rPr>
+                <w:rFonts w:ascii="Segoe UI Emoji" w:hAnsi="Segoe UI Emoji" w:cs="Segoe UI Emoji"/>
+                <w:b/>
+                <w:bCs/>
+              </w:rPr>
+              <w:t xml:space="preserve">injects </w:t>
+            </w:r>
+            <w:proofErr w:type="spellStart"/>
+            <w:r>
+              <w:rPr>
+                <w:rFonts w:ascii="Segoe UI Emoji" w:hAnsi="Segoe UI Emoji" w:cs="Segoe UI Emoji"/>
+                <w:b/>
+                <w:bCs/>
+              </w:rPr>
+              <w:t>runbook_url</w:t>
+            </w:r>
+            <w:proofErr w:type="spellEnd"/>
+            <w:r>
+              <w:rPr>
+                <w:rFonts w:ascii="Segoe UI Emoji" w:hAnsi="Segoe UI Emoji" w:cs="Segoe UI Emoji"/>
+                <w:b/>
+                <w:bCs/>
+              </w:rPr>
+              <w:t xml:space="preserve"> into Grafana annotations</w:t>
+            </w:r>
+            <w:r>
+              <w:rPr>
+                <w:rFonts w:ascii="Segoe UI Emoji" w:hAnsi="Segoe UI Emoji" w:cs="Segoe UI Emoji"/>
+              </w:rPr>
+              <w:t xml:space="preserve"> (so deploy markers in Grafana also link directly to the runbook)?</w:t>
+            </w:r>
+          </w:p>
+        </w:tc>
+        <w:tc>
+          <w:tcPr>
+            <w:tcW w:w="2925" w:type="dxa"/>
+          </w:tcPr>
+          <w:p>
+            <w:pPr>
+              <w:pStyle w:val="ListParagraph"/>
+              <w:numPr>
+                <w:ilvl w:val="0"/>
+                <w:numId w:val="1"/>
+              </w:numPr>
+              <w:ind w:left="0" w:firstLine="0"/>
+            </w:pPr>
+          </w:p>
+        </w:tc>
+      </w:tr>
+      <w:tr>
+        <w:tc>
+          <w:tcPr>
+            <w:tcW w:w="2515" w:type="dxa"/>
+          </w:tcPr>
+          <w:p>
+            <w:pPr>
+              <w:pStyle w:val="ListParagraph"/>
+              <w:numPr>
+                <w:ilvl w:val="0"/>
+                <w:numId w:val="1"/>
+              </w:numPr>
+              <w:ind w:left="0" w:firstLine="0"/>
+            </w:pPr>
+          </w:p>
+        </w:tc>
+        <w:tc>
+          <w:tcPr>
+            <w:tcW w:w="3190" w:type="dxa"/>
+          </w:tcPr>
+          <w:p>
+            <w:pPr>
+              <w:pStyle w:val="ListParagraph"/>
+              <w:ind w:left="0"/>
+              <w:rPr>
+                <w:rFonts w:ascii="Segoe UI Emoji" w:hAnsi="Segoe UI Emoji" w:cs="Segoe UI Emoji"/>
+              </w:rPr>
+            </w:pPr>
+          </w:p>
+        </w:tc>
+        <w:tc>
+          <w:tcPr>
+            <w:tcW w:w="2925" w:type="dxa"/>
+          </w:tcPr>
+          <w:p>
+            <w:pPr>
+              <w:pStyle w:val="ListParagraph"/>
+              <w:numPr>
+                <w:ilvl w:val="0"/>
+                <w:numId w:val="1"/>
+              </w:numPr>
+              <w:ind w:left="0" w:firstLine="0"/>
+            </w:pPr>
+          </w:p>
+        </w:tc>
+      </w:tr>
+      <w:tr>
+        <w:tc>
+          <w:tcPr>
+            <w:tcW w:w="2515" w:type="dxa"/>
+          </w:tcPr>
+          <w:p>
+            <w:pPr>
+              <w:pStyle w:val="ListParagraph"/>
+              <w:numPr>
+                <w:ilvl w:val="0"/>
+                <w:numId w:val="1"/>
+              </w:numPr>
+              <w:ind w:left="0" w:firstLine="0"/>
+            </w:pPr>
+          </w:p>
+        </w:tc>
+        <w:tc>
+          <w:tcPr>
+            <w:tcW w:w="3190" w:type="dxa"/>
+          </w:tcPr>
+          <w:p>
+            <w:pPr>
+              <w:pStyle w:val="ListParagraph"/>
+              <w:ind w:left="0"/>
+              <w:rPr>
+                <w:rFonts w:ascii="Segoe UI Emoji" w:hAnsi="Segoe UI Emoji" w:cs="Segoe UI Emoji"/>
+              </w:rPr>
+            </w:pPr>
+            <w:r>
+              <w:rPr>
+                <w:rFonts w:ascii="Segoe UI Emoji" w:hAnsi="Segoe UI Emoji" w:cs="Segoe UI Emoji"/>
+              </w:rPr>
+              <w:t xml:space="preserve">👉 Do you want me to also extend </w:t>
+            </w:r>
+            <w:proofErr w:type="gramStart"/>
+            <w:r>
+              <w:rPr>
+                <w:rFonts w:ascii="Segoe UI Emoji" w:hAnsi="Segoe UI Emoji" w:cs="Segoe UI Emoji"/>
+              </w:rPr>
+              <w:t>this</w:t>
+            </w:r>
+            <w:proofErr w:type="gramEnd"/>
+            <w:r>
+              <w:rPr>
+                <w:rFonts w:ascii="Segoe UI Emoji" w:hAnsi="Segoe UI Emoji" w:cs="Segoe UI Emoji"/>
+              </w:rPr>
+              <w:t xml:space="preserve"> so the </w:t>
+            </w:r>
+            <w:r>
+              <w:rPr>
+                <w:rFonts w:ascii="Segoe UI Emoji" w:hAnsi="Segoe UI Emoji" w:cs="Segoe UI Emoji"/>
+                <w:b/>
+                <w:bCs/>
+              </w:rPr>
+              <w:t>Grafana annotation shows multiple quick links</w:t>
+            </w:r>
+            <w:r>
+              <w:rPr>
+                <w:rFonts w:ascii="Segoe UI Emoji" w:hAnsi="Segoe UI Emoji" w:cs="Segoe UI Emoji"/>
+              </w:rPr>
+              <w:t xml:space="preserve"> (Runbook + Kibana logs + Zipkin traces) in a single marker text?</w:t>
+            </w:r>
+          </w:p>
+        </w:tc>
+        <w:tc>
+          <w:tcPr>
+            <w:tcW w:w="2925" w:type="dxa"/>
+          </w:tcPr>
+          <w:p>
+            <w:pPr>
+              <w:pStyle w:val="ListParagraph"/>
+              <w:numPr>
+                <w:ilvl w:val="0"/>
+                <w:numId w:val="1"/>
+              </w:numPr>
+              <w:ind w:left="0" w:firstLine="0"/>
+            </w:pPr>
+          </w:p>
+        </w:tc>
+      </w:tr>
+      <w:tr>
+        <w:tc>
+          <w:tcPr>
+            <w:tcW w:w="2515" w:type="dxa"/>
+          </w:tcPr>
+          <w:p>
+            <w:pPr>
+              <w:pStyle w:val="ListParagraph"/>
+              <w:numPr>
+                <w:ilvl w:val="0"/>
+                <w:numId w:val="1"/>
+              </w:numPr>
+              <w:ind w:left="0" w:firstLine="0"/>
+            </w:pPr>
+          </w:p>
+        </w:tc>
+        <w:tc>
+          <w:tcPr>
+            <w:tcW w:w="3190" w:type="dxa"/>
+          </w:tcPr>
+          <w:p>
+            <w:pPr>
+              <w:pStyle w:val="ListParagraph"/>
+              <w:ind w:left="0"/>
+              <w:rPr>
+                <w:rFonts w:ascii="Segoe UI Emoji" w:hAnsi="Segoe UI Emoji" w:cs="Segoe UI Emoji"/>
+              </w:rPr>
+            </w:pPr>
+            <w:r>
+              <w:rPr>
+                <w:rFonts w:ascii="Segoe UI Emoji" w:hAnsi="Segoe UI Emoji" w:cs="Segoe UI Emoji"/>
+              </w:rPr>
+              <w:t xml:space="preserve">👉 Do you want me to also add a </w:t>
+            </w:r>
+            <w:r>
+              <w:rPr>
+                <w:rFonts w:ascii="Segoe UI Emoji" w:hAnsi="Segoe UI Emoji" w:cs="Segoe UI Emoji"/>
+                <w:b/>
+                <w:bCs/>
+              </w:rPr>
+              <w:t xml:space="preserve">Kibana log enrichment </w:t>
+            </w:r>
+            <w:proofErr w:type="gramStart"/>
+            <w:r>
+              <w:rPr>
+                <w:rFonts w:ascii="Segoe UI Emoji" w:hAnsi="Segoe UI Emoji" w:cs="Segoe UI Emoji"/>
+                <w:b/>
+                <w:bCs/>
+              </w:rPr>
+              <w:t>step</w:t>
+            </w:r>
+            <w:proofErr w:type="gramEnd"/>
+            <w:r>
+              <w:rPr>
+                <w:rFonts w:ascii="Segoe UI Emoji" w:hAnsi="Segoe UI Emoji" w:cs="Segoe UI Emoji"/>
+              </w:rPr>
+              <w:t xml:space="preserve"> so every log entry automatically includes the </w:t>
+            </w:r>
+            <w:proofErr w:type="spellStart"/>
+            <w:r>
+              <w:rPr>
+                <w:rFonts w:ascii="Segoe UI Emoji" w:hAnsi="Segoe UI Emoji" w:cs="Segoe UI Emoji"/>
+                <w:b/>
+                <w:bCs/>
+              </w:rPr>
+              <w:t>runbook_url</w:t>
+            </w:r>
+            <w:proofErr w:type="spellEnd"/>
+            <w:r>
+              <w:rPr>
+                <w:rFonts w:ascii="Segoe UI Emoji" w:hAnsi="Segoe UI Emoji" w:cs="Segoe UI Emoji"/>
+              </w:rPr>
+              <w:t xml:space="preserve"> and </w:t>
+            </w:r>
+            <w:proofErr w:type="spellStart"/>
+            <w:r>
+              <w:rPr>
+                <w:rFonts w:ascii="Segoe UI Emoji" w:hAnsi="Segoe UI Emoji" w:cs="Segoe UI Emoji"/>
+                <w:b/>
+                <w:bCs/>
+              </w:rPr>
+              <w:t>pipeline_id</w:t>
+            </w:r>
+            <w:proofErr w:type="spellEnd"/>
+            <w:r>
+              <w:rPr>
+                <w:rFonts w:ascii="Segoe UI Emoji" w:hAnsi="Segoe UI Emoji" w:cs="Segoe UI Emoji"/>
+              </w:rPr>
+              <w:t xml:space="preserve"> fields, </w:t>
+            </w:r>
+            <w:r>
+              <w:rPr>
+                <w:rFonts w:ascii="Segoe UI Emoji" w:hAnsi="Segoe UI Emoji" w:cs="Segoe UI Emoji"/>
+              </w:rPr>
+              <w:lastRenderedPageBreak/>
+              <w:t xml:space="preserve">making them </w:t>
+            </w:r>
+            <w:proofErr w:type="spellStart"/>
+            <w:r>
+              <w:rPr>
+                <w:rFonts w:ascii="Segoe UI Emoji" w:hAnsi="Segoe UI Emoji" w:cs="Segoe UI Emoji"/>
+              </w:rPr>
+              <w:t>queryable</w:t>
+            </w:r>
+            <w:proofErr w:type="spellEnd"/>
+            <w:r>
+              <w:rPr>
+                <w:rFonts w:ascii="Segoe UI Emoji" w:hAnsi="Segoe UI Emoji" w:cs="Segoe UI Emoji"/>
+              </w:rPr>
+              <w:t xml:space="preserve"> and linkable too?</w:t>
+            </w:r>
+          </w:p>
+        </w:tc>
+        <w:tc>
+          <w:tcPr>
+            <w:tcW w:w="2925" w:type="dxa"/>
+          </w:tcPr>
+          <w:p>
+            <w:pPr>
+              <w:pStyle w:val="ListParagraph"/>
+              <w:numPr>
+                <w:ilvl w:val="0"/>
+                <w:numId w:val="1"/>
+              </w:numPr>
+              <w:ind w:left="0" w:firstLine="0"/>
+            </w:pPr>
+          </w:p>
+        </w:tc>
+      </w:tr>
+      <w:tr>
+        <w:tc>
+          <w:tcPr>
+            <w:tcW w:w="2515" w:type="dxa"/>
+          </w:tcPr>
+          <w:p>
+            <w:pPr>
+              <w:pStyle w:val="ListParagraph"/>
+              <w:numPr>
+                <w:ilvl w:val="0"/>
+                <w:numId w:val="1"/>
+              </w:numPr>
+              <w:ind w:left="0" w:firstLine="0"/>
+            </w:pPr>
+          </w:p>
+        </w:tc>
+        <w:tc>
+          <w:tcPr>
+            <w:tcW w:w="3190" w:type="dxa"/>
+          </w:tcPr>
+          <w:p>
+            <w:pPr>
+              <w:pStyle w:val="ListParagraph"/>
+              <w:ind w:left="0"/>
+              <w:rPr>
+                <w:rFonts w:ascii="Segoe UI Emoji" w:hAnsi="Segoe UI Emoji" w:cs="Segoe UI Emoji"/>
+              </w:rPr>
+            </w:pPr>
+            <w:r>
+              <w:rPr>
+                <w:rFonts w:ascii="Segoe UI Emoji" w:hAnsi="Segoe UI Emoji" w:cs="Segoe UI Emoji"/>
+              </w:rPr>
+              <w:t xml:space="preserve">👉 Do you want me to also extend this so </w:t>
+            </w:r>
+            <w:proofErr w:type="spellStart"/>
+            <w:r>
+              <w:rPr>
+                <w:rFonts w:ascii="Segoe UI Emoji" w:hAnsi="Segoe UI Emoji" w:cs="Segoe UI Emoji"/>
+                <w:b/>
+                <w:bCs/>
+              </w:rPr>
+              <w:t>Alertmanager</w:t>
+            </w:r>
+            <w:proofErr w:type="spellEnd"/>
+            <w:r>
+              <w:rPr>
+                <w:rFonts w:ascii="Segoe UI Emoji" w:hAnsi="Segoe UI Emoji" w:cs="Segoe UI Emoji"/>
+                <w:b/>
+                <w:bCs/>
+              </w:rPr>
+              <w:t xml:space="preserve"> alerts automatically include the </w:t>
+            </w:r>
+            <w:proofErr w:type="spellStart"/>
+            <w:r>
+              <w:rPr>
+                <w:rFonts w:ascii="Segoe UI Emoji" w:hAnsi="Segoe UI Emoji" w:cs="Segoe UI Emoji"/>
+                <w:b/>
+                <w:bCs/>
+              </w:rPr>
+              <w:t>pipeline_id</w:t>
+            </w:r>
+            <w:proofErr w:type="spellEnd"/>
+            <w:r>
+              <w:rPr>
+                <w:rFonts w:ascii="Segoe UI Emoji" w:hAnsi="Segoe UI Emoji" w:cs="Segoe UI Emoji"/>
+              </w:rPr>
+              <w:t xml:space="preserve"> (so responders can jump straight to the GitHub Actions run that deployed the failing version)?</w:t>
+            </w:r>
+          </w:p>
+        </w:tc>
+        <w:tc>
+          <w:tcPr>
+            <w:tcW w:w="2925" w:type="dxa"/>
+          </w:tcPr>
+          <w:p>
+            <w:pPr>
+              <w:pStyle w:val="ListParagraph"/>
+              <w:numPr>
+                <w:ilvl w:val="0"/>
+                <w:numId w:val="1"/>
+              </w:numPr>
+              <w:ind w:left="0" w:firstLine="0"/>
+            </w:pPr>
+          </w:p>
+        </w:tc>
+      </w:tr>
+      <w:tr>
+        <w:tc>
+          <w:tcPr>
+            <w:tcW w:w="2515" w:type="dxa"/>
+          </w:tcPr>
+          <w:p>
+            <w:pPr>
+              <w:pStyle w:val="ListParagraph"/>
+              <w:numPr>
+                <w:ilvl w:val="0"/>
+                <w:numId w:val="1"/>
+              </w:numPr>
+              <w:ind w:left="0" w:firstLine="0"/>
+            </w:pPr>
+          </w:p>
+        </w:tc>
+        <w:tc>
+          <w:tcPr>
+            <w:tcW w:w="3190" w:type="dxa"/>
+          </w:tcPr>
+          <w:p>
+            <w:pPr>
+              <w:pStyle w:val="ListParagraph"/>
+              <w:ind w:left="0"/>
+              <w:rPr>
+                <w:rFonts w:ascii="Segoe UI Emoji" w:hAnsi="Segoe UI Emoji" w:cs="Segoe UI Emoji"/>
+              </w:rPr>
+            </w:pPr>
+            <w:r>
+              <w:rPr>
+                <w:rFonts w:ascii="Segoe UI Emoji" w:hAnsi="Segoe UI Emoji" w:cs="Segoe UI Emoji"/>
+              </w:rPr>
+              <w:t xml:space="preserve">👉 Do you want me to also wire this so </w:t>
+            </w:r>
+            <w:r>
+              <w:rPr>
+                <w:rFonts w:ascii="Segoe UI Emoji" w:hAnsi="Segoe UI Emoji" w:cs="Segoe UI Emoji"/>
+                <w:b/>
+                <w:bCs/>
+              </w:rPr>
+              <w:t xml:space="preserve">Grafana panels auto-filter by </w:t>
+            </w:r>
+            <w:proofErr w:type="spellStart"/>
+            <w:r>
+              <w:rPr>
+                <w:rFonts w:ascii="Segoe UI Emoji" w:hAnsi="Segoe UI Emoji" w:cs="Segoe UI Emoji"/>
+                <w:b/>
+                <w:bCs/>
+              </w:rPr>
+              <w:t>pipeline_id</w:t>
+            </w:r>
+            <w:proofErr w:type="spellEnd"/>
+            <w:r>
+              <w:rPr>
+                <w:rFonts w:ascii="Segoe UI Emoji" w:hAnsi="Segoe UI Emoji" w:cs="Segoe UI Emoji"/>
+              </w:rPr>
+              <w:t xml:space="preserve"> (so you can view metrics/logs for a specific deploy version)?</w:t>
+            </w:r>
+          </w:p>
+        </w:tc>
+        <w:tc>
+          <w:tcPr>
+            <w:tcW w:w="2925" w:type="dxa"/>
+          </w:tcPr>
+          <w:p>
+            <w:pPr>
+              <w:pStyle w:val="ListParagraph"/>
+              <w:numPr>
+                <w:ilvl w:val="0"/>
+                <w:numId w:val="1"/>
+              </w:numPr>
+              <w:ind w:left="0" w:firstLine="0"/>
+            </w:pPr>
+          </w:p>
+        </w:tc>
+      </w:tr>
+      <w:tr>
+        <w:tc>
+          <w:tcPr>
+            <w:tcW w:w="2515" w:type="dxa"/>
+          </w:tcPr>
+          <w:p>
+            <w:pPr>
+              <w:pStyle w:val="ListParagraph"/>
+              <w:numPr>
+                <w:ilvl w:val="0"/>
+                <w:numId w:val="1"/>
+              </w:numPr>
+              <w:ind w:left="0" w:firstLine="0"/>
+            </w:pPr>
+          </w:p>
+        </w:tc>
+        <w:tc>
+          <w:tcPr>
+            <w:tcW w:w="3190" w:type="dxa"/>
+          </w:tcPr>
+          <w:p>
+            <w:pPr>
+              <w:pStyle w:val="ListParagraph"/>
+              <w:ind w:left="0"/>
+              <w:rPr>
+                <w:rFonts w:ascii="Segoe UI Emoji" w:hAnsi="Segoe UI Emoji" w:cs="Segoe UI Emoji"/>
+              </w:rPr>
+            </w:pPr>
+            <w:r>
+              <w:rPr>
+                <w:rFonts w:ascii="Segoe UI Emoji" w:hAnsi="Segoe UI Emoji" w:cs="Segoe UI Emoji"/>
+              </w:rPr>
+              <w:t xml:space="preserve">👉 Do you want me to also add a </w:t>
+            </w:r>
+            <w:r>
+              <w:rPr>
+                <w:rFonts w:ascii="Segoe UI Emoji" w:hAnsi="Segoe UI Emoji" w:cs="Segoe UI Emoji"/>
+                <w:b/>
+                <w:bCs/>
+              </w:rPr>
+              <w:t>Grafana comparison panel</w:t>
+            </w:r>
+            <w:r>
+              <w:rPr>
+                <w:rFonts w:ascii="Segoe UI Emoji" w:hAnsi="Segoe UI Emoji" w:cs="Segoe UI Emoji"/>
+              </w:rPr>
+              <w:t xml:space="preserve"> so you can see </w:t>
+            </w:r>
+            <w:r>
+              <w:rPr>
+                <w:rFonts w:ascii="Segoe UI Emoji" w:hAnsi="Segoe UI Emoji" w:cs="Segoe UI Emoji"/>
+                <w:i/>
+                <w:iCs/>
+              </w:rPr>
+              <w:t xml:space="preserve">side-by-side metrics for two </w:t>
+            </w:r>
+            <w:proofErr w:type="spellStart"/>
+            <w:r>
+              <w:rPr>
+                <w:rFonts w:ascii="Segoe UI Emoji" w:hAnsi="Segoe UI Emoji" w:cs="Segoe UI Emoji"/>
+                <w:i/>
+                <w:iCs/>
+              </w:rPr>
+              <w:t>pipeline_ids</w:t>
+            </w:r>
+            <w:proofErr w:type="spellEnd"/>
+            <w:r>
+              <w:rPr>
+                <w:rFonts w:ascii="Segoe UI Emoji" w:hAnsi="Segoe UI Emoji" w:cs="Segoe UI Emoji"/>
+              </w:rPr>
+              <w:t xml:space="preserve"> (e.g., canary vs stable)?</w:t>
+            </w:r>
+          </w:p>
+        </w:tc>
+        <w:tc>
+          <w:tcPr>
+            <w:tcW w:w="2925" w:type="dxa"/>
+          </w:tcPr>
+          <w:p>
+            <w:pPr>
+              <w:pStyle w:val="ListParagraph"/>
+              <w:numPr>
+                <w:ilvl w:val="0"/>
+                <w:numId w:val="1"/>
+              </w:numPr>
+              <w:ind w:left="0" w:firstLine="0"/>
+            </w:pPr>
+          </w:p>
+        </w:tc>
+      </w:tr>
+      <w:tr>
+        <w:tc>
+          <w:tcPr>
+            <w:tcW w:w="2515" w:type="dxa"/>
+          </w:tcPr>
+          <w:p>
+            <w:pPr>
+              <w:pStyle w:val="ListParagraph"/>
+              <w:numPr>
+                <w:ilvl w:val="0"/>
+                <w:numId w:val="1"/>
+              </w:numPr>
+              <w:ind w:left="0" w:firstLine="0"/>
+            </w:pPr>
+          </w:p>
+        </w:tc>
+        <w:tc>
+          <w:tcPr>
+            <w:tcW w:w="3190" w:type="dxa"/>
+          </w:tcPr>
+          <w:p>
+            <w:pPr>
+              <w:pStyle w:val="ListParagraph"/>
+              <w:ind w:left="0"/>
+              <w:rPr>
+                <w:rFonts w:ascii="Segoe UI Emoji" w:hAnsi="Segoe UI Emoji" w:cs="Segoe UI Emoji"/>
+              </w:rPr>
+            </w:pPr>
+            <w:r>
+              <w:rPr>
+                <w:rFonts w:ascii="Segoe UI Emoji" w:hAnsi="Segoe UI Emoji" w:cs="Segoe UI Emoji"/>
+              </w:rPr>
+              <w:t xml:space="preserve">👉 Do you want me to also create a </w:t>
+            </w:r>
+            <w:r>
+              <w:rPr>
+                <w:rFonts w:ascii="Segoe UI Emoji" w:hAnsi="Segoe UI Emoji" w:cs="Segoe UI Emoji"/>
+                <w:b/>
+                <w:bCs/>
+              </w:rPr>
+              <w:t>Grafana dashboard template</w:t>
+            </w:r>
+            <w:r>
+              <w:rPr>
+                <w:rFonts w:ascii="Segoe UI Emoji" w:hAnsi="Segoe UI Emoji" w:cs="Segoe UI Emoji"/>
+              </w:rPr>
+              <w:t xml:space="preserve"> that auto-detects the </w:t>
+            </w:r>
+            <w:r>
+              <w:rPr>
+                <w:rFonts w:ascii="Segoe UI Emoji" w:hAnsi="Segoe UI Emoji" w:cs="Segoe UI Emoji"/>
+                <w:b/>
+                <w:bCs/>
+              </w:rPr>
+              <w:t xml:space="preserve">latest </w:t>
+            </w:r>
+            <w:proofErr w:type="spellStart"/>
+            <w:r>
+              <w:rPr>
+                <w:rFonts w:ascii="Segoe UI Emoji" w:hAnsi="Segoe UI Emoji" w:cs="Segoe UI Emoji"/>
+                <w:b/>
+                <w:bCs/>
+              </w:rPr>
+              <w:t>pipeline_id</w:t>
+            </w:r>
+            <w:proofErr w:type="spellEnd"/>
+            <w:r>
+              <w:rPr>
+                <w:rFonts w:ascii="Segoe UI Emoji" w:hAnsi="Segoe UI Emoji" w:cs="Segoe UI Emoji"/>
+                <w:b/>
+                <w:bCs/>
+              </w:rPr>
+              <w:t xml:space="preserve"> vs the previous one</w:t>
+            </w:r>
+            <w:r>
+              <w:rPr>
+                <w:rFonts w:ascii="Segoe UI Emoji" w:hAnsi="Segoe UI Emoji" w:cs="Segoe UI Emoji"/>
+              </w:rPr>
+              <w:t xml:space="preserve"> (so you don’t have to pick manually for comparisons)?</w:t>
+            </w:r>
           </w:p>
         </w:tc>
         <w:tc>

</xml_diff>